<commit_message>
job-search: pass on Sensei Labs, shorten cover letter
Chris declined the Sensei Labs VP Engineering role (did not submit) because
the ~7-engineer team and small company are below the scale he wants, despite
one of the cleanest AI-first-SDLC thesis fits on the board. Move the tracker
card to Done (passed) and log the decision in the 2026-08-10 daily note.
Shorten the cover letter to 3 paste-ready paragraphs; files remain on file.

Co-Authored-By: Claude Opus 4.6 <noreply@anthropic.com>
</commit_message>
<xml_diff>
--- a/00 Human/30 Projects/Job Search/Applications/Sensei Labs/chris-monnat-cover-letter(sensei-labs).docx
+++ b/00 Human/30 Projects/Job Search/Applications/Sensei Labs/chris-monnat-cover-letter(sensei-labs).docx
@@ -363,7 +363,7 @@
         <w:rPr>
           <w:sz w:val="22"/>
         </w:rPr>
-        <w:t xml:space="preserve">The VP seat you are describing wants someone who can make a lean team deliver far beyond its size, mostly by rebuilding how the team works with AI. That is the work I do now. As CTO of an AI consulting practice, I moved AI-assisted development from scattered one-off scripts into a shared, evaluated platform of agent skills, evaluation harnesses, and review gates that hold quality as code volume climbs. I have a point of view on where AI actually speeds a team up and where it just creates cleanup, earned in production rather than in a slide deck.</w:t>
+        <w:t xml:space="preserve">The VP seat you are describing wants someone who can make a lean team deliver far beyond its size, mostly by rebuilding how it works with AI. That is the work I do now. As CTO of an AI consulting practice, I moved AI-assisted development from scattered scripts into a shared platform of agent skills, evals, and review gates that hold quality as code volume climbs. I read the hands-on part as the best part, not a caveat. I am most useful in the code, the reviews, and the architecture calls, and I have run small teams that way.</w:t>
       </w:r>
     </w:p>
     <w:p>
@@ -375,7 +375,7 @@
         <w:rPr>
           <w:sz w:val="22"/>
         </w:rPr>
-        <w:t xml:space="preserve">I read the hands-on part as the best part, not a caveat. I am most useful in the code, the reviews, and the architecture calls, and I have run small teams that way. At Phone2Action I brought planning and release structure to a Series-A team and doubled it without losing quality, and today I stay hands-on for enterprise clients while owning the technical direction. Six engineers and the Platform team is the shape I want to lead, not one I would have to shrink into.</w:t>
+        <w:t xml:space="preserve">Conductor Modern is a delivery problem I have lived. I took a revenue-critical platform from zero to production in under 90 days, owning the service boundaries, data isolation, and the security posture an enterprise buyer expects, then founded and consolidated the platform behind more than 100 properties through a post-acquisition integration without dropping uptime. Harmony is the part I would be most excited to push on, since I have carried agentic and RAG-backed systems from architecture through governed production with the evals and guardrails that keep AI trustworthy for enterprise users.</w:t>
       </w:r>
     </w:p>
     <w:p>
@@ -387,43 +387,7 @@
         <w:rPr>
           <w:sz w:val="22"/>
         </w:rPr>
-        <w:t xml:space="preserve">Conductor Modern is a delivery problem I have lived. I took a revenue-critical platform from zero to production in under 90 days on a post-divestiture reset, owning the service boundaries, data isolation, and the security and compliance posture an enterprise buyer expects. Earlier I founded the platform behind more than 100 properties and consolidated them onto a modern stack through a post-acquisition integration, holding uptime through the migration. That is the muscle a customer cutover and a legacy sunset need.</w:t>
-      </w:r>
-    </w:p>
-    <w:p>
-      <w:pPr>
-        <w:spacing w:after="240" w:before="0"/>
-        <w:jc w:val="left"/>
-      </w:pPr>
-      <w:r>
-        <w:rPr>
-          <w:sz w:val="22"/>
-        </w:rPr>
-        <w:t xml:space="preserve">Harmony is the part I would be most excited to push on. I have carried agentic and RAG-backed systems from architecture through governed production, with the evaluation, guardrails, and permission-aware behavior that keep AI trustworthy when the user is an enterprise operator. My firm line is simple. AI should make engineers stronger and keep slop out of the product, and every AI investment should survive a hard review.</w:t>
-      </w:r>
-    </w:p>
-    <w:p>
-      <w:pPr>
-        <w:spacing w:after="240" w:before="0"/>
-        <w:jc w:val="left"/>
-      </w:pPr>
-      <w:r>
-        <w:rPr>
-          <w:sz w:val="22"/>
-        </w:rPr>
-        <w:t xml:space="preserve">I will be straight about the stretch. My cloud depth is AWS and GCP rather than Azure, and the PPM and transformation domain is new to me. Architecture and operating principles carry across clouds, and I close domain gaps quickly by getting into the product and the customer problem. On the parts that matter most to this role, AI-first delivery and hands-on leadership, I am already there.</w:t>
-      </w:r>
-    </w:p>
-    <w:p>
-      <w:pPr>
-        <w:spacing w:after="240" w:before="0"/>
-        <w:jc w:val="left"/>
-      </w:pPr>
-      <w:r>
-        <w:rPr>
-          <w:sz w:val="22"/>
-        </w:rPr>
-        <w:t xml:space="preserve">I would welcome a conversation about how to run engineering for Conductor as you finish the rewrite and grow the team.</w:t>
+        <w:t xml:space="preserve">I will be straight about the stretch. My cloud depth is AWS and GCP rather than Azure, and the PPM domain is new to me, but architecture carries across clouds and I close domain gaps by getting into the product. On the parts that matter most here, AI-first delivery and hands-on leadership, I am already there. I would welcome a conversation about running engineering for Conductor as you finish the rewrite and grow the team.</w:t>
       </w:r>
     </w:p>
     <w:p>

</xml_diff>